<commit_message>
feat: add authentication middleware, update routes, and enhance letter request functionality
</commit_message>
<xml_diff>
--- a/server/src/docs/letter_template.docx
+++ b/server/src/docs/letter_template.docx
@@ -92,7 +92,7 @@
           </mc:Choice>
           <mc:Fallback>
             <w:pict>
-              <v:group w14:anchorId="5D520FBA" id="Group 1" o:spid="_x0000_s1026" style="position:absolute;margin-left:19.45pt;margin-top:0;width:573.1pt;height:11in;z-index:-251658240;mso-wrap-distance-left:0;mso-wrap-distance-right:0;mso-position-horizontal-relative:page;mso-position-vertical-relative:page" coordsize="72783,100584" o:gfxdata="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">
+              <v:group w14:anchorId="3FBBC4BE" id="Group 1" o:spid="_x0000_s1026" style="position:absolute;margin-left:19.45pt;margin-top:0;width:573.1pt;height:11in;z-index:-251658240;mso-wrap-distance-left:0;mso-wrap-distance-right:0;mso-position-horizontal-relative:page;mso-position-vertical-relative:page" coordsize="72783,100584" o:gfxdata="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">
                 <v:shapetype id="_x0000_t75" coordsize="21600,21600" o:spt="75" o:preferrelative="t" path="m@4@5l@4@11@9@11@9@5xe" filled="f" stroked="f">
                   <v:stroke joinstyle="miter"/>
                   <v:formulas>
@@ -206,7 +206,13 @@
         <w:ind w:left="360"/>
       </w:pPr>
       <w:r>
-        <w:t>To</w:t>
+        <w:t xml:space="preserve">[Organization Name] / </w:t>
+      </w:r>
+      <w:r>
+        <w:t>T</w:t>
+      </w:r>
+      <w:r>
+        <w:t>O</w:t>
       </w:r>
       <w:r>
         <w:rPr>
@@ -350,14 +356,12 @@
         </w:rPr>
         <w:t xml:space="preserve"> </w:t>
       </w:r>
-      <w:proofErr w:type="gramStart"/>
       <w:r>
         <w:rPr>
           <w:sz w:val="24"/>
         </w:rPr>
         <w:t>write</w:t>
       </w:r>
-      <w:proofErr w:type="gramEnd"/>
       <w:r>
         <w:rPr>
           <w:spacing w:val="-9"/>
@@ -435,7 +439,28 @@
           <w:b/>
           <w:sz w:val="24"/>
         </w:rPr>
-        <w:t>Mr.</w:t>
+        <w:t>[Title]</w:t>
+      </w:r>
+      <w:r>
+        <w:rPr>
+          <w:b/>
+          <w:sz w:val="24"/>
+        </w:rPr>
+        <w:t>.</w:t>
+      </w:r>
+      <w:r>
+        <w:rPr>
+          <w:b/>
+          <w:sz w:val="24"/>
+        </w:rPr>
+        <w:t xml:space="preserve"> [Fullname]</w:t>
+      </w:r>
+      <w:r>
+        <w:rPr>
+          <w:b/>
+          <w:sz w:val="24"/>
+        </w:rPr>
+        <w:t>.</w:t>
       </w:r>
       <w:r>
         <w:rPr>
@@ -448,9 +473,10 @@
       <w:r>
         <w:rPr>
           <w:b/>
-          <w:sz w:val="24"/>
-        </w:rPr>
-        <w:t>Ashong Abdallah</w:t>
+          <w:spacing w:val="-8"/>
+          <w:sz w:val="24"/>
+        </w:rPr>
+        <w:t>[Title]</w:t>
       </w:r>
       <w:r>
         <w:rPr>
@@ -470,17 +496,45 @@
       <w:r>
         <w:rPr>
           <w:b/>
-          <w:sz w:val="24"/>
-        </w:rPr>
-        <w:t>Mr.</w:t>
-      </w:r>
-      <w:r>
-        <w:rPr>
-          <w:b/>
           <w:spacing w:val="-8"/>
           <w:sz w:val="24"/>
         </w:rPr>
-        <w:t xml:space="preserve"> </w:t>
+        <w:t xml:space="preserve">[Lastname] </w:t>
+      </w:r>
+      <w:r>
+        <w:rPr>
+          <w:b/>
+          <w:sz w:val="24"/>
+        </w:rPr>
+        <w:t>is</w:t>
+      </w:r>
+      <w:r>
+        <w:rPr>
+          <w:b/>
+          <w:spacing w:val="-7"/>
+          <w:sz w:val="24"/>
+        </w:rPr>
+        <w:t xml:space="preserve"> </w:t>
+      </w:r>
+      <w:r>
+        <w:rPr>
+          <w:sz w:val="24"/>
+        </w:rPr>
+        <w:t>a</w:t>
+      </w:r>
+      <w:r>
+        <w:rPr>
+          <w:spacing w:val="-9"/>
+          <w:sz w:val="24"/>
+        </w:rPr>
+        <w:t xml:space="preserve"> </w:t>
+      </w:r>
+      <w:r>
+        <w:rPr>
+          <w:b/>
+          <w:sz w:val="24"/>
+        </w:rPr>
+        <w:t>level</w:t>
       </w:r>
       <w:r>
         <w:rPr>
@@ -488,19 +542,118 @@
           <w:spacing w:val="-8"/>
           <w:sz w:val="24"/>
         </w:rPr>
-        <w:t xml:space="preserve">Ashong </w:t>
-      </w:r>
-      <w:r>
-        <w:rPr>
-          <w:b/>
-          <w:sz w:val="24"/>
-        </w:rPr>
-        <w:t>is</w:t>
-      </w:r>
-      <w:r>
-        <w:rPr>
-          <w:b/>
-          <w:spacing w:val="-7"/>
+        <w:t xml:space="preserve"> </w:t>
+      </w:r>
+      <w:r>
+        <w:rPr>
+          <w:b/>
+          <w:spacing w:val="-8"/>
+          <w:sz w:val="24"/>
+        </w:rPr>
+        <w:t xml:space="preserve">[Level] </w:t>
+      </w:r>
+      <w:r>
+        <w:rPr>
+          <w:sz w:val="24"/>
+        </w:rPr>
+        <w:t>student at</w:t>
+      </w:r>
+      <w:r>
+        <w:rPr>
+          <w:spacing w:val="17"/>
+          <w:sz w:val="24"/>
+        </w:rPr>
+        <w:t xml:space="preserve"> </w:t>
+      </w:r>
+      <w:r>
+        <w:rPr>
+          <w:sz w:val="24"/>
+        </w:rPr>
+        <w:t>the</w:t>
+      </w:r>
+      <w:r>
+        <w:rPr>
+          <w:spacing w:val="19"/>
+          <w:sz w:val="24"/>
+        </w:rPr>
+        <w:t xml:space="preserve"> </w:t>
+      </w:r>
+      <w:r>
+        <w:rPr>
+          <w:sz w:val="24"/>
+        </w:rPr>
+        <w:t>Ghana</w:t>
+      </w:r>
+      <w:r>
+        <w:rPr>
+          <w:spacing w:val="18"/>
+          <w:sz w:val="24"/>
+        </w:rPr>
+        <w:t xml:space="preserve"> </w:t>
+      </w:r>
+      <w:r>
+        <w:rPr>
+          <w:sz w:val="24"/>
+        </w:rPr>
+        <w:t>Communication</w:t>
+      </w:r>
+      <w:r>
+        <w:rPr>
+          <w:spacing w:val="20"/>
+          <w:sz w:val="24"/>
+        </w:rPr>
+        <w:t xml:space="preserve"> </w:t>
+      </w:r>
+      <w:r>
+        <w:rPr>
+          <w:sz w:val="24"/>
+        </w:rPr>
+        <w:t>Technology</w:t>
+      </w:r>
+      <w:r>
+        <w:rPr>
+          <w:spacing w:val="19"/>
+          <w:sz w:val="24"/>
+        </w:rPr>
+        <w:t xml:space="preserve"> </w:t>
+      </w:r>
+      <w:r>
+        <w:rPr>
+          <w:sz w:val="24"/>
+        </w:rPr>
+        <w:t>University</w:t>
+      </w:r>
+      <w:r>
+        <w:rPr>
+          <w:spacing w:val="24"/>
+          <w:sz w:val="24"/>
+        </w:rPr>
+        <w:t xml:space="preserve"> </w:t>
+      </w:r>
+      <w:r>
+        <w:rPr>
+          <w:b/>
+          <w:sz w:val="24"/>
+        </w:rPr>
+        <w:t>(GCTU),</w:t>
+      </w:r>
+      <w:r>
+        <w:rPr>
+          <w:b/>
+          <w:spacing w:val="19"/>
+          <w:sz w:val="24"/>
+        </w:rPr>
+        <w:t xml:space="preserve"> </w:t>
+      </w:r>
+      <w:r>
+        <w:rPr>
+          <w:sz w:val="24"/>
+        </w:rPr>
+        <w:t>offering</w:t>
+      </w:r>
+      <w:r>
+        <w:rPr>
+          <w:spacing w:val="20"/>
           <w:sz w:val="24"/>
         </w:rPr>
         <w:t xml:space="preserve"> </w:t>
@@ -513,155 +666,6 @@
       </w:r>
       <w:r>
         <w:rPr>
-          <w:spacing w:val="-9"/>
-          <w:sz w:val="24"/>
-        </w:rPr>
-        <w:t xml:space="preserve"> </w:t>
-      </w:r>
-      <w:r>
-        <w:rPr>
-          <w:b/>
-          <w:sz w:val="24"/>
-        </w:rPr>
-        <w:t>level</w:t>
-      </w:r>
-      <w:r>
-        <w:rPr>
-          <w:b/>
-          <w:spacing w:val="-8"/>
-          <w:sz w:val="24"/>
-        </w:rPr>
-        <w:t xml:space="preserve"> </w:t>
-      </w:r>
-      <w:r>
-        <w:rPr>
-          <w:b/>
-          <w:sz w:val="24"/>
-        </w:rPr>
-        <w:t>300</w:t>
-      </w:r>
-      <w:r>
-        <w:rPr>
-          <w:b/>
-          <w:spacing w:val="-8"/>
-          <w:sz w:val="24"/>
-        </w:rPr>
-        <w:t xml:space="preserve"> </w:t>
-      </w:r>
-      <w:r>
-        <w:rPr>
-          <w:sz w:val="24"/>
-        </w:rPr>
-        <w:t>student at</w:t>
-      </w:r>
-      <w:r>
-        <w:rPr>
-          <w:spacing w:val="17"/>
-          <w:sz w:val="24"/>
-        </w:rPr>
-        <w:t xml:space="preserve"> </w:t>
-      </w:r>
-      <w:r>
-        <w:rPr>
-          <w:sz w:val="24"/>
-        </w:rPr>
-        <w:t>the</w:t>
-      </w:r>
-      <w:r>
-        <w:rPr>
-          <w:spacing w:val="19"/>
-          <w:sz w:val="24"/>
-        </w:rPr>
-        <w:t xml:space="preserve"> </w:t>
-      </w:r>
-      <w:r>
-        <w:rPr>
-          <w:sz w:val="24"/>
-        </w:rPr>
-        <w:t>Ghana</w:t>
-      </w:r>
-      <w:r>
-        <w:rPr>
-          <w:spacing w:val="18"/>
-          <w:sz w:val="24"/>
-        </w:rPr>
-        <w:t xml:space="preserve"> </w:t>
-      </w:r>
-      <w:r>
-        <w:rPr>
-          <w:sz w:val="24"/>
-        </w:rPr>
-        <w:t>Communication</w:t>
-      </w:r>
-      <w:r>
-        <w:rPr>
-          <w:spacing w:val="20"/>
-          <w:sz w:val="24"/>
-        </w:rPr>
-        <w:t xml:space="preserve"> </w:t>
-      </w:r>
-      <w:r>
-        <w:rPr>
-          <w:sz w:val="24"/>
-        </w:rPr>
-        <w:t>Technology</w:t>
-      </w:r>
-      <w:r>
-        <w:rPr>
-          <w:spacing w:val="19"/>
-          <w:sz w:val="24"/>
-        </w:rPr>
-        <w:t xml:space="preserve"> </w:t>
-      </w:r>
-      <w:r>
-        <w:rPr>
-          <w:sz w:val="24"/>
-        </w:rPr>
-        <w:t>University</w:t>
-      </w:r>
-      <w:r>
-        <w:rPr>
-          <w:spacing w:val="24"/>
-          <w:sz w:val="24"/>
-        </w:rPr>
-        <w:t xml:space="preserve"> </w:t>
-      </w:r>
-      <w:r>
-        <w:rPr>
-          <w:b/>
-          <w:sz w:val="24"/>
-        </w:rPr>
-        <w:t>(GCTU),</w:t>
-      </w:r>
-      <w:r>
-        <w:rPr>
-          <w:b/>
-          <w:spacing w:val="19"/>
-          <w:sz w:val="24"/>
-        </w:rPr>
-        <w:t xml:space="preserve"> </w:t>
-      </w:r>
-      <w:r>
-        <w:rPr>
-          <w:sz w:val="24"/>
-        </w:rPr>
-        <w:t>offering</w:t>
-      </w:r>
-      <w:r>
-        <w:rPr>
-          <w:spacing w:val="20"/>
-          <w:sz w:val="24"/>
-        </w:rPr>
-        <w:t xml:space="preserve"> </w:t>
-      </w:r>
-      <w:r>
-        <w:rPr>
-          <w:sz w:val="24"/>
-        </w:rPr>
-        <w:t>a</w:t>
-      </w:r>
-      <w:r>
-        <w:rPr>
           <w:spacing w:val="21"/>
           <w:sz w:val="24"/>
         </w:rPr>
@@ -670,40 +674,10 @@
       <w:r>
         <w:rPr>
           <w:b/>
-          <w:sz w:val="24"/>
-        </w:rPr>
-        <w:t>Bachelor</w:t>
-      </w:r>
-      <w:r>
-        <w:rPr>
-          <w:b/>
-          <w:spacing w:val="19"/>
-          <w:sz w:val="24"/>
-        </w:rPr>
-        <w:t xml:space="preserve"> </w:t>
-      </w:r>
-      <w:r>
-        <w:rPr>
-          <w:b/>
-          <w:sz w:val="24"/>
-        </w:rPr>
-        <w:t>of</w:t>
-      </w:r>
-      <w:r>
-        <w:rPr>
-          <w:b/>
-          <w:spacing w:val="19"/>
-          <w:sz w:val="24"/>
-        </w:rPr>
-        <w:t xml:space="preserve"> </w:t>
-      </w:r>
-      <w:r>
-        <w:rPr>
-          <w:b/>
           <w:spacing w:val="-2"/>
           <w:sz w:val="24"/>
         </w:rPr>
-        <w:t>Science</w:t>
+        <w:t>[Programme]</w:t>
       </w:r>
       <w:r>
         <w:rPr>
@@ -712,24 +686,6 @@
           <w:sz w:val="24"/>
         </w:rPr>
         <w:t xml:space="preserve"> </w:t>
-      </w:r>
-      <w:proofErr w:type="spellStart"/>
-      <w:r>
-        <w:rPr>
-          <w:b/>
-          <w:spacing w:val="-2"/>
-          <w:sz w:val="24"/>
-        </w:rPr>
-        <w:t>Programme</w:t>
-      </w:r>
-      <w:proofErr w:type="spellEnd"/>
-      <w:r>
-        <w:rPr>
-          <w:b/>
-          <w:spacing w:val="-2"/>
-          <w:sz w:val="24"/>
-        </w:rPr>
-        <w:t xml:space="preserve"> in Information Technology </w:t>
       </w:r>
       <w:r>
         <w:rPr>
@@ -768,23 +724,7 @@
         <w:jc w:val="both"/>
       </w:pPr>
       <w:r>
-        <w:t xml:space="preserve">This attachment program is to enable students </w:t>
-      </w:r>
-      <w:proofErr w:type="gramStart"/>
-      <w:r>
-        <w:t>gain</w:t>
-      </w:r>
-      <w:proofErr w:type="gramEnd"/>
-      <w:r>
-        <w:t xml:space="preserve"> professional work </w:t>
-      </w:r>
-      <w:proofErr w:type="gramStart"/>
-      <w:r>
-        <w:t>experiences</w:t>
-      </w:r>
-      <w:proofErr w:type="gramEnd"/>
-      <w:r>
-        <w:t>, develop and refine</w:t>
+        <w:t>This attachment program is to enable students gain professional work experiences, develop and refine</w:t>
       </w:r>
       <w:r>
         <w:rPr>
@@ -937,18 +877,24 @@
           <w:b/>
           <w:bCs/>
         </w:rPr>
-        <w:t>Mr. Ashong Abdallah</w:t>
-      </w:r>
-      <w:r>
-        <w:t xml:space="preserve"> the opportunity to enable him </w:t>
-      </w:r>
-      <w:proofErr w:type="gramStart"/>
-      <w:r>
-        <w:t>serve</w:t>
-      </w:r>
-      <w:proofErr w:type="gramEnd"/>
-      <w:r>
-        <w:t xml:space="preserve"> and prepare for the job market.</w:t>
+        <w:t>[Title]</w:t>
+      </w:r>
+      <w:r>
+        <w:rPr>
+          <w:b/>
+          <w:bCs/>
+        </w:rPr>
+        <w:t xml:space="preserve">. </w:t>
+      </w:r>
+      <w:r>
+        <w:rPr>
+          <w:b/>
+          <w:bCs/>
+        </w:rPr>
+        <w:t xml:space="preserve">[Fullname] </w:t>
+      </w:r>
+      <w:r>
+        <w:t>the opportunity to enable him serve and prepare for the job market.</w:t>
       </w:r>
     </w:p>
     <w:p>
@@ -974,29 +920,34 @@
         <w:t>contact</w:t>
       </w:r>
       <w:r>
-        <w:rPr>
-          <w:spacing w:val="2"/>
-        </w:rPr>
-        <w:t xml:space="preserve"> </w:t>
-      </w:r>
-      <w:r>
-        <w:rPr>
-          <w:b/>
-        </w:rPr>
-        <w:t>Mr.</w:t>
-      </w:r>
-      <w:r>
-        <w:rPr>
-          <w:b/>
-          <w:spacing w:val="-1"/>
-        </w:rPr>
-        <w:t xml:space="preserve"> </w:t>
-      </w:r>
-      <w:r>
-        <w:rPr>
-          <w:b/>
-        </w:rPr>
-        <w:t>Ashong</w:t>
+        <w:t xml:space="preserve"> </w:t>
+      </w:r>
+      <w:r>
+        <w:rPr>
+          <w:b/>
+          <w:spacing w:val="-8"/>
+        </w:rPr>
+        <w:t>[Title]</w:t>
+      </w:r>
+      <w:r>
+        <w:rPr>
+          <w:b/>
+        </w:rPr>
+        <w:t>.</w:t>
+      </w:r>
+      <w:r>
+        <w:rPr>
+          <w:b/>
+          <w:spacing w:val="-8"/>
+        </w:rPr>
+        <w:t xml:space="preserve"> </w:t>
+      </w:r>
+      <w:r>
+        <w:rPr>
+          <w:b/>
+          <w:spacing w:val="-8"/>
+        </w:rPr>
+        <w:t>[Lastname]</w:t>
       </w:r>
       <w:r>
         <w:rPr>
@@ -1014,21 +965,8 @@
       <w:r>
         <w:rPr>
           <w:b/>
-          <w:spacing w:val="-1"/>
-        </w:rPr>
-        <w:t xml:space="preserve"> </w:t>
-      </w:r>
-      <w:r>
-        <w:rPr>
-          <w:b/>
-        </w:rPr>
-        <w:t>055</w:t>
-      </w:r>
-      <w:r>
-        <w:rPr>
-          <w:b/>
-        </w:rPr>
-        <w:t xml:space="preserve"> 535 9339</w:t>
+        </w:rPr>
+        <w:t xml:space="preserve"> [Phone]</w:t>
       </w:r>
       <w:r>
         <w:rPr>

</xml_diff>